<commit_message>
台割 final: P.08 reflects PwC feedback (RtM business model, RtM functions); update figure-selection notes
Co-Authored-By: Claude Opus 5.5 <noreply@anthropic.com>
Claude-Session: https://claude.ai/code/session_01RaAHJjFzQLBQzv3hdCW4ED
</commit_message>
<xml_diff>
--- a/cover-proposals/daiwari/final/final_notes_06_figure_selection.docx
+++ b/cover-proposals/daiwari/final/final_notes_06_figure_selection.docx
@@ -696,7 +696,7 @@
         <w:pStyle w:val="Heading1"/>
       </w:pPr>
       <w:r>
-        <w:t>P.08　トレーディング事業</w:t>
+        <w:t>P.08　トレーディング事業（PwC様フィードバック 10/5 反映）</w:t>
       </w:r>
     </w:p>
     <w:p>
@@ -707,7 +707,18 @@
         <w:t>【元の図】</w:t>
       </w:r>
       <w:r>
-        <w:t>金属資源G_P37（RtM＝Resource to Market：世界地図上の調達・販売フロー＋商品例）</w:t>
+        <w:t>金属資源G_P37（RtM＝Resource to Market）、金属資源G_P9（RtM事業のビジネスモデル）、RtM紹介資料（Resource to Market／RtM Group Main Products and Business Solutions）</w:t>
+      </w:r>
+    </w:p>
+    <w:p>
+      <w:r>
+        <w:rPr>
+          <w:b/>
+        </w:rPr>
+        <w:t>【構成】</w:t>
+      </w:r>
+      <w:r>
+        <w:t>①RtM＝Resource to Marketの関係図 → ②RtM事業のビジネスモデル → ③RtMの多様な機能</w:t>
       </w:r>
     </w:p>
     <w:p>
@@ -717,8 +728,21 @@
         </w:rPr>
         <w:t>【残したもの】</w:t>
       </w:r>
+      <w:r/>
+    </w:p>
+    <w:p>
       <w:r>
-        <w:t>調達側（投資先・他サプライヤー）→RtMI（シンガポール）→販売先（各RtM・地域市場）の関係、取扱商品例</w:t>
+        <w:t>・関係図：調達側（投資先・他サプライヤー）→RtMI（シンガポール）→販売先の関係、取扱商品例</w:t>
+      </w:r>
+    </w:p>
+    <w:p>
+      <w:r>
+        <w:t>・ビジネスモデル：MC（第三者取引・MC保有資産）→RtM→顧客基盤の流れと、4つの価値（安定供給／事業機会の発掘／継続的な付加価値創出／インテリジェンス機能の発揮）。左右に顧客への提供価値4点（Sustainability／Professionalism／Market Intelligence／Global Network）</w:t>
+      </w:r>
+    </w:p>
+    <w:p>
+      <w:r>
+        <w:t>・多様な機能：Risk Management／Logistics／Financing／Marketing and Procurement／Carbon Reduction の5機能と、それぞれの要点</w:t>
       </w:r>
     </w:p>
     <w:p>
@@ -729,7 +753,7 @@
         <w:t>【省いたもの】</w:t>
       </w:r>
       <w:r>
-        <w:t>世界地図、各矢印の個別の商品名</w:t>
+        <w:t>世界地図、各矢印の個別商品名、提供価値カードの英文説明（要点を日本語1行に要約）、RtM紹介資料の商品別の円環図</w:t>
       </w:r>
     </w:p>
     <w:p>
@@ -743,17 +767,27 @@
     </w:p>
     <w:p>
       <w:r>
-        <w:t>・ストーリーラインの掲載内容「15業界×50カ国×約1,000社の販売網で市場をつなぐ」を伝えるには、「シンガポールを中心に調達と販売をつなぐ」構造が分かることが重要と考え、地図を関係図に置き換えました。</w:t>
+        <w:t>・PwC様フィードバック①「RtMの事業ビジネスモデルを中心にした内容に差し替え」に沿い、ビジネスモデル図をページの中心に据えました。</w:t>
       </w:r>
     </w:p>
     <w:p>
       <w:r>
-        <w:t>・事業・プロジェクトの世界地図をP.09に置くため、P.08で地図を重ねないようにしました。</w:t>
+        <w:t>・ビジネスモデル図は、投資（本体）と販売（RtM）が情報でつながる好循環を示しており、ストーリーラインの「投資と販売の両輪」を最も具体的に表すため、要素を省かずに残しました。</w:t>
       </w:r>
     </w:p>
     <w:p>
       <w:r>
-        <w:t>・留意点「販売顧客に投資目的の主体と誤認される表現は避ける」に配慮し、販売機能（調達→販売）の流れを主役にしています。</w:t>
+        <w:t>・PwC様フィードバック②に沿い、見出しを「RtMの多様な機能」とし、機能一覧を指定の5項目に差し替えました。本文は銅の事例を交えた説明文を想定しています。</w:t>
+      </w:r>
+    </w:p>
+    <w:p>
+      <w:r>
+        <w:t>・従来の「トレーディング事業の事例（銅）」の枠は、ビジネスモデル（サブタイトル「一つの商品の中で、投資から販売まで一気通貫でつなぐ」）と②の説明文（銅の事例）に統合しました。</w:t>
+      </w:r>
+    </w:p>
+    <w:p>
+      <w:r>
+        <w:t>・留意点「販売顧客に投資目的の主体と誤認される表現は避ける」に配慮し、販売機能（調達→販売、顧客への提供価値）を主役にしています。</w:t>
       </w:r>
     </w:p>
     <w:p>

</xml_diff>